<commit_message>
Update Документ Microsoft Word.docx
</commit_message>
<xml_diff>
--- a/Месяц 1/Среда и терминал/3. Установка пакетов/Документ Microsoft Word.docx
+++ b/Месяц 1/Среда и терминал/3. Установка пакетов/Документ Microsoft Word.docx
@@ -9,6 +9,10 @@
         </w:rPr>
       </w:pPr>
       <w:r>
+        <w:rPr>
+          <w:noProof/>
+          <w:lang w:eastAsia="ru-RU"/>
+        </w:rPr>
         <w:drawing>
           <wp:inline distT="0" distB="0" distL="0" distR="0" wp14:anchorId="27BF95CB" wp14:editId="55DD39A4">
             <wp:extent cx="5940425" cy="505203"/>
@@ -57,7 +61,58 @@
         <w:t xml:space="preserve"> – </w:t>
       </w:r>
       <w:r>
-        <w:t xml:space="preserve">список директорий, где система ищет исполняемые файлы/команды при вызове их в терминале. </w:t>
+        <w:t xml:space="preserve">переменная окружения, в которой хранится </w:t>
+      </w:r>
+      <w:r>
+        <w:t xml:space="preserve">список директорий, где система ищет исполняемые команды при вызове их в терминале. </w:t>
+      </w:r>
+      <w:r>
+        <w:t xml:space="preserve"> Если команды нет в списках </w:t>
+      </w:r>
+      <w:r>
+        <w:rPr>
+          <w:lang w:val="en-US"/>
+        </w:rPr>
+        <w:t>PATH</w:t>
+      </w:r>
+      <w:r>
+        <w:t xml:space="preserve">, то будет ошибка. В </w:t>
+      </w:r>
+      <w:r>
+        <w:rPr>
+          <w:lang w:val="en-US"/>
+        </w:rPr>
+        <w:t>PATH</w:t>
+      </w:r>
+      <w:r>
+        <w:t xml:space="preserve"> </w:t>
+      </w:r>
+      <w:r>
+        <w:t xml:space="preserve">так же можно добавить свой путь до файлов, чтобы запускать из любой директории. При вводе команды в терминал, </w:t>
+      </w:r>
+      <w:r>
+        <w:rPr>
+          <w:lang w:val="en-US"/>
+        </w:rPr>
+        <w:t>shell</w:t>
+      </w:r>
+      <w:r>
+        <w:t xml:space="preserve"> </w:t>
+      </w:r>
+      <w:r>
+        <w:t>ищет путь, в котором есть</w:t>
+      </w:r>
+      <w:r>
+        <w:t xml:space="preserve"> введенная </w:t>
+      </w:r>
+      <w:r>
+        <w:t xml:space="preserve">команда, начиная с первого элемента списка </w:t>
+      </w:r>
+      <w:r>
+        <w:rPr>
+          <w:lang w:val="en-US"/>
+        </w:rPr>
+        <w:t>PATH</w:t>
       </w:r>
       <w:bookmarkStart w:id="0" w:name="_GoBack"/>
       <w:bookmarkEnd w:id="0"/>

</xml_diff>